<commit_message>
Add Scenario 1 screenshots and correct rule/target details
</commit_message>
<xml_diff>
--- a/docs/Enterprise_Wazuh_SOC_Deployment_Complete_Documentation.docx
+++ b/docs/Enterprise_Wazuh_SOC_Deployment_Complete_Documentation.docx
@@ -2673,51 +2673,139 @@
         <w:spacing w:after="140"/>
       </w:pPr>
     </w:p>
-    <w:tbl>
-      <w:tblPr>
-        <w:tblW w:type="dxa" w:w="9640"/>
-        <w:tblBorders>
-          <w:top w:val="single" w:color="auto" w:sz="4"/>
-          <w:left w:val="single" w:color="auto" w:sz="4"/>
-          <w:bottom w:val="single" w:color="auto" w:sz="4"/>
-          <w:right w:val="single" w:color="auto" w:sz="4"/>
-          <w:insideH w:val="single" w:color="auto" w:sz="4"/>
-          <w:insideV w:val="single" w:color="auto" w:sz="4"/>
-        </w:tblBorders>
-      </w:tblPr>
-      <w:tblGrid>
-        <w:gridCol w:w="9640"/>
-      </w:tblGrid>
-      <w:tr>
-        <w:tc>
-          <w:tcPr>
-            <w:tcW w:type="dxa" w:w="9640"/>
-            <w:shd w:fill="F2F2F2" w:val="clear"/>
-            <w:tcMar>
-              <w:top w:type="dxa" w:w="200"/>
-              <w:left w:type="dxa" w:w="200"/>
-              <w:bottom w:type="dxa" w:w="200"/>
-              <w:right w:type="dxa" w:w="200"/>
-            </w:tcMar>
-          </w:tcPr>
-          <w:p>
-            <w:pPr>
-              <w:jc w:val="center"/>
-            </w:pPr>
-            <w:r>
-              <w:rPr>
-                <w:i/>
-                <w:iCs/>
-                <w:color w:val="666666"/>
-                <w:sz w:val="20"/>
-                <w:szCs w:val="20"/>
-              </w:rPr>
-              <w:t xml:space="preserve">[ SCREENSHOT PLACEHOLDER — Scenario 1 — supporting evidence ]</w:t>
-            </w:r>
-          </w:p>
-        </w:tc>
-      </w:tr>
-    </w:tbl>
+    <w:p>
+      <w:pPr>
+        <w:pStyle w:val="Heading3"/>
+        <w:spacing w:after="100" w:before="200"/>
+      </w:pPr>
+      <w:r>
+        <w:t xml:space="preserve">Supporting Evidence</w:t>
+      </w:r>
+    </w:p>
+    <w:p>
+      <w:pPr>
+        <w:spacing w:after="60" w:before="160"/>
+        <w:jc w:val="center"/>
+      </w:pPr>
+      <w:r>
+        <w:drawing>
+          <wp:inline distT="0" distB="0" distL="0" distR="0">
+            <wp:extent cx="4953000" cy="2600325"/>
+            <wp:effectExtent t="0" r="0" b="0" l="0"/>
+            <wp:docPr id="1" name="" descr="" title=""/>
+            <wp:cNvGraphicFramePr>
+              <a:graphicFrameLocks xmlns:a="http://schemas.openxmlformats.org/drawingml/2006/main" noChangeAspect="1"/>
+            </wp:cNvGraphicFramePr>
+            <a:graphic xmlns:a="http://schemas.openxmlformats.org/drawingml/2006/main">
+              <a:graphicData uri="http://schemas.openxmlformats.org/drawingml/2006/picture">
+                <pic:pic xmlns:pic="http://schemas.openxmlformats.org/drawingml/2006/picture">
+                  <pic:nvPicPr>
+                    <pic:cNvPr id="0" name="" descr=""/>
+                    <pic:cNvPicPr>
+                      <a:picLocks noChangeAspect="1" noChangeArrowheads="1"/>
+                    </pic:cNvPicPr>
+                  </pic:nvPicPr>
+                  <pic:blipFill>
+                    <a:blip r:embed="rId11" cstate="none"/>
+                    <a:srcRect/>
+                    <a:stretch>
+                      <a:fillRect/>
+                    </a:stretch>
+                  </pic:blipFill>
+                  <pic:spPr bwMode="auto">
+                    <a:xfrm>
+                      <a:off x="0" y="0"/>
+                      <a:ext cx="4953000" cy="2600325"/>
+                    </a:xfrm>
+                    <a:prstGeom prst="rect">
+                      <a:avLst/>
+                    </a:prstGeom>
+                  </pic:spPr>
+                </pic:pic>
+              </a:graphicData>
+            </a:graphic>
+          </wp:inline>
+        </w:drawing>
+      </w:r>
+    </w:p>
+    <w:p>
+      <w:pPr>
+        <w:spacing w:after="200"/>
+        <w:jc w:val="center"/>
+      </w:pPr>
+      <w:r>
+        <w:rPr>
+          <w:i/>
+          <w:iCs/>
+          <w:color w:val="666666"/>
+          <w:sz w:val="18"/>
+          <w:szCs w:val="18"/>
+        </w:rPr>
+        <w:t xml:space="preserve">Wazuh rule metadata: rule 60204, level 10, frequency threshold 8, “Multiple Windows Logon Failures”</w:t>
+      </w:r>
+    </w:p>
+    <w:p>
+      <w:pPr>
+        <w:spacing w:after="60" w:before="160"/>
+        <w:jc w:val="center"/>
+      </w:pPr>
+      <w:r>
+        <w:drawing>
+          <wp:inline distT="0" distB="0" distL="0" distR="0">
+            <wp:extent cx="4953000" cy="2600325"/>
+            <wp:effectExtent t="0" r="0" b="0" l="0"/>
+            <wp:docPr id="1" name="" descr="" title=""/>
+            <wp:cNvGraphicFramePr>
+              <a:graphicFrameLocks xmlns:a="http://schemas.openxmlformats.org/drawingml/2006/main" noChangeAspect="1"/>
+            </wp:cNvGraphicFramePr>
+            <a:graphic xmlns:a="http://schemas.openxmlformats.org/drawingml/2006/main">
+              <a:graphicData uri="http://schemas.openxmlformats.org/drawingml/2006/picture">
+                <pic:pic xmlns:pic="http://schemas.openxmlformats.org/drawingml/2006/picture">
+                  <pic:nvPicPr>
+                    <pic:cNvPr id="0" name="" descr=""/>
+                    <pic:cNvPicPr>
+                      <a:picLocks noChangeAspect="1" noChangeArrowheads="1"/>
+                    </pic:cNvPicPr>
+                  </pic:nvPicPr>
+                  <pic:blipFill>
+                    <a:blip r:embed="rId12" cstate="none"/>
+                    <a:srcRect/>
+                    <a:stretch>
+                      <a:fillRect/>
+                    </a:stretch>
+                  </pic:blipFill>
+                  <pic:spPr bwMode="auto">
+                    <a:xfrm>
+                      <a:off x="0" y="0"/>
+                      <a:ext cx="4953000" cy="2600325"/>
+                    </a:xfrm>
+                    <a:prstGeom prst="rect">
+                      <a:avLst/>
+                    </a:prstGeom>
+                  </pic:spPr>
+                </pic:pic>
+              </a:graphicData>
+            </a:graphic>
+          </wp:inline>
+        </w:drawing>
+      </w:r>
+    </w:p>
+    <w:p>
+      <w:pPr>
+        <w:spacing w:after="200"/>
+        <w:jc w:val="center"/>
+      </w:pPr>
+      <w:r>
+        <w:rPr>
+          <w:i/>
+          <w:iCs/>
+          <w:color w:val="666666"/>
+          <w:sz w:val="18"/>
+          <w:szCs w:val="18"/>
+        </w:rPr>
+        <w:t xml:space="preserve">Final MITRE ATT&amp;CK classification: T1110, tactic Credential Access, technique Brute Force</w:t>
+      </w:r>
+    </w:p>
     <w:p>
       <w:pPr>
         <w:spacing w:after="280"/>

</xml_diff>

<commit_message>
Add Scenario 2 screenshots and correct account-isolation narrative
</commit_message>
<xml_diff>
--- a/docs/Enterprise_Wazuh_SOC_Deployment_Complete_Documentation.docx
+++ b/docs/Enterprise_Wazuh_SOC_Deployment_Complete_Documentation.docx
@@ -2991,7 +2991,7 @@
         <w:spacing w:after="140"/>
       </w:pPr>
       <w:r>
-        <w:t xml:space="preserve">A confidential file on the INT-FileSrv Samba share was tampered with directly on the host, outside business hours, growing from 37 to 114 bytes. Beyond the guide's baseline scenario, a full incident-response exercise was layered on top: an active-session check via smbstatus, account isolation using a disposable test account (a real production account was very nearly locked by mistake in the process — caught and reversed before impact), hash-based evidence preservation matching Wazuh's own recorded checksum, and finally restoration of the file with hash verification.</w:t>
+        <w:t xml:space="preserve">A confidential file on the INT-FileSrv Samba share (originally 37 bytes) was tampered with directly on the host, outside business hours, via a shell command appending an unauthorized line, growing it to 114 bytes. Beyond the guide's baseline scenario, a full incident-response exercise was layered on top: an active-session check via smbstatus, account isolation, hash-based evidence preservation matching Wazuh's own recorded checksum, and finally restoration of the file with independent hash verification. The account-isolation step did not go as intended: the real analyst account was mistakenly locked instead of a disposable test account, then unlocked once the error was noticed — reported here as it happened rather than downplayed.</w:t>
       </w:r>
     </w:p>
     <w:p>
@@ -3104,7 +3104,7 @@
                 <w:sz w:val="20"/>
                 <w:szCs w:val="20"/>
               </w:rPr>
-              <w:t xml:space="preserve">Modification of confidential.txt on the Samba share</w:t>
+              <w:t xml:space="preserve">An unauthorized line appended to confidential.txt on the Samba share</w:t>
             </w:r>
           </w:p>
         </w:tc>
@@ -3149,7 +3149,7 @@
                 <w:sz w:val="20"/>
                 <w:szCs w:val="20"/>
               </w:rPr>
-              <w:t xml:space="preserve">After hours, timestamp captured in the FIM alert</w:t>
+              <w:t xml:space="preserve">After hours — Sep 4, 2026, 21:34 UTC</w:t>
             </w:r>
           </w:p>
         </w:tc>
@@ -3284,7 +3284,7 @@
                 <w:sz w:val="20"/>
                 <w:szCs w:val="20"/>
               </w:rPr>
-              <w:t xml:space="preserve">Wazuh rule 550 (FIM modification alert)</w:t>
+              <w:t xml:space="preserve">Wazuh rule 550, Level 7, tactic Impact (FIM modification alert)</w:t>
             </w:r>
           </w:p>
         </w:tc>
@@ -3374,7 +3374,7 @@
                 <w:sz w:val="20"/>
                 <w:szCs w:val="20"/>
               </w:rPr>
-              <w:t xml:space="preserve">File restored from a verified-clean copy; recommend tightening share permissions (currently world-writable) and enabling access auditing in addition to FIM</w:t>
+              <w:t xml:space="preserve">File restored and independently hash-verified; recommend tightening share permissions (currently world-writable) and enabling access auditing in addition to FIM</w:t>
             </w:r>
           </w:p>
         </w:tc>
@@ -3399,54 +3399,142 @@
         <w:spacing w:after="140"/>
       </w:pPr>
       <w:r>
-        <w:t xml:space="preserve">The centerpiece finding of this scenario: when the tampered file was restored to its original state, Wazuh's FIM Inventory (the current-state database) updated silently in the background with no corresponding alert or event generated. This is a genuine gap between the Inventory sync mechanism and the alerting pipeline — a file being “quietly fixed” is exactly the kind of change a SOC would also want visibility into, and currently isn't getting it by default.</w:t>
-      </w:r>
-    </w:p>
-    <w:tbl>
-      <w:tblPr>
-        <w:tblW w:type="dxa" w:w="9640"/>
-        <w:tblBorders>
-          <w:top w:val="single" w:color="auto" w:sz="4"/>
-          <w:left w:val="single" w:color="auto" w:sz="4"/>
-          <w:bottom w:val="single" w:color="auto" w:sz="4"/>
-          <w:right w:val="single" w:color="auto" w:sz="4"/>
-          <w:insideH w:val="single" w:color="auto" w:sz="4"/>
-          <w:insideV w:val="single" w:color="auto" w:sz="4"/>
-        </w:tblBorders>
-      </w:tblPr>
-      <w:tblGrid>
-        <w:gridCol w:w="9640"/>
-      </w:tblGrid>
-      <w:tr>
-        <w:tc>
-          <w:tcPr>
-            <w:tcW w:type="dxa" w:w="9640"/>
-            <w:shd w:fill="F2F2F2" w:val="clear"/>
-            <w:tcMar>
-              <w:top w:type="dxa" w:w="200"/>
-              <w:left w:type="dxa" w:w="200"/>
-              <w:bottom w:type="dxa" w:w="200"/>
-              <w:right w:type="dxa" w:w="200"/>
-            </w:tcMar>
-          </w:tcPr>
-          <w:p>
-            <w:pPr>
-              <w:jc w:val="center"/>
-            </w:pPr>
-            <w:r>
-              <w:rPr>
-                <w:i/>
-                <w:iCs/>
-                <w:color w:val="666666"/>
-                <w:sz w:val="20"/>
-                <w:szCs w:val="20"/>
-              </w:rPr>
-              <w:t xml:space="preserve">[ SCREENSHOT PLACEHOLDER — Scenario 2 — supporting evidence ]</w:t>
-            </w:r>
-          </w:p>
-        </w:tc>
-      </w:tr>
-    </w:tbl>
+        <w:t xml:space="preserve">The centerpiece finding of this scenario: when the tampered file was restored to its original state, Wazuh's FIM Inventory (the current-state database) updated silently in the background — correctly reflecting the restored SHA-256 checksum — but with no corresponding alert or event generated. This is a genuine gap between the Inventory sync mechanism and the alerting pipeline — a file being “quietly fixed” is exactly the kind of change a SOC would also want visibility into, and currently isn't getting it by default.</w:t>
+      </w:r>
+    </w:p>
+    <w:p>
+      <w:pPr>
+        <w:pStyle w:val="Heading3"/>
+        <w:spacing w:after="100" w:before="200"/>
+      </w:pPr>
+      <w:r>
+        <w:t xml:space="preserve">Supporting Evidence</w:t>
+      </w:r>
+    </w:p>
+    <w:p>
+      <w:pPr>
+        <w:spacing w:after="60" w:before="160"/>
+        <w:jc w:val="center"/>
+      </w:pPr>
+      <w:r>
+        <w:drawing>
+          <wp:inline distT="0" distB="0" distL="0" distR="0">
+            <wp:extent cx="4953000" cy="2600325"/>
+            <wp:effectExtent t="0" r="0" b="0" l="0"/>
+            <wp:docPr id="1" name="" descr="" title=""/>
+            <wp:cNvGraphicFramePr>
+              <a:graphicFrameLocks xmlns:a="http://schemas.openxmlformats.org/drawingml/2006/main" noChangeAspect="1"/>
+            </wp:cNvGraphicFramePr>
+            <a:graphic xmlns:a="http://schemas.openxmlformats.org/drawingml/2006/main">
+              <a:graphicData uri="http://schemas.openxmlformats.org/drawingml/2006/picture">
+                <pic:pic xmlns:pic="http://schemas.openxmlformats.org/drawingml/2006/picture">
+                  <pic:nvPicPr>
+                    <pic:cNvPr id="0" name="" descr=""/>
+                    <pic:cNvPicPr>
+                      <a:picLocks noChangeAspect="1" noChangeArrowheads="1"/>
+                    </pic:cNvPicPr>
+                  </pic:nvPicPr>
+                  <pic:blipFill>
+                    <a:blip r:embed="rId13" cstate="none"/>
+                    <a:srcRect/>
+                    <a:stretch>
+                      <a:fillRect/>
+                    </a:stretch>
+                  </pic:blipFill>
+                  <pic:spPr bwMode="auto">
+                    <a:xfrm>
+                      <a:off x="0" y="0"/>
+                      <a:ext cx="4953000" cy="2600325"/>
+                    </a:xfrm>
+                    <a:prstGeom prst="rect">
+                      <a:avLst/>
+                    </a:prstGeom>
+                  </pic:spPr>
+                </pic:pic>
+              </a:graphicData>
+            </a:graphic>
+          </wp:inline>
+        </w:drawing>
+      </w:r>
+    </w:p>
+    <w:p>
+      <w:pPr>
+        <w:spacing w:after="200"/>
+        <w:jc w:val="center"/>
+      </w:pPr>
+      <w:r>
+        <w:rPr>
+          <w:i/>
+          <w:iCs/>
+          <w:color w:val="666666"/>
+          <w:sz w:val="18"/>
+          <w:szCs w:val="18"/>
+        </w:rPr>
+        <w:t xml:space="preserve">Wazuh rule metadata: rule 550, Level 7, MITRE T1565.001, tactic Impact, technique Stored Data Manipulation</w:t>
+      </w:r>
+    </w:p>
+    <w:p>
+      <w:pPr>
+        <w:spacing w:after="60" w:before="160"/>
+        <w:jc w:val="center"/>
+      </w:pPr>
+      <w:r>
+        <w:drawing>
+          <wp:inline distT="0" distB="0" distL="0" distR="0">
+            <wp:extent cx="4953000" cy="2600325"/>
+            <wp:effectExtent t="0" r="0" b="0" l="0"/>
+            <wp:docPr id="1" name="" descr="" title=""/>
+            <wp:cNvGraphicFramePr>
+              <a:graphicFrameLocks xmlns:a="http://schemas.openxmlformats.org/drawingml/2006/main" noChangeAspect="1"/>
+            </wp:cNvGraphicFramePr>
+            <a:graphic xmlns:a="http://schemas.openxmlformats.org/drawingml/2006/main">
+              <a:graphicData uri="http://schemas.openxmlformats.org/drawingml/2006/picture">
+                <pic:pic xmlns:pic="http://schemas.openxmlformats.org/drawingml/2006/picture">
+                  <pic:nvPicPr>
+                    <pic:cNvPr id="0" name="" descr=""/>
+                    <pic:cNvPicPr>
+                      <a:picLocks noChangeAspect="1" noChangeArrowheads="1"/>
+                    </pic:cNvPicPr>
+                  </pic:nvPicPr>
+                  <pic:blipFill>
+                    <a:blip r:embed="rId14" cstate="none"/>
+                    <a:srcRect/>
+                    <a:stretch>
+                      <a:fillRect/>
+                    </a:stretch>
+                  </pic:blipFill>
+                  <pic:spPr bwMode="auto">
+                    <a:xfrm>
+                      <a:off x="0" y="0"/>
+                      <a:ext cx="4953000" cy="2600325"/>
+                    </a:xfrm>
+                    <a:prstGeom prst="rect">
+                      <a:avLst/>
+                    </a:prstGeom>
+                  </pic:spPr>
+                </pic:pic>
+              </a:graphicData>
+            </a:graphic>
+          </wp:inline>
+        </w:drawing>
+      </w:r>
+    </w:p>
+    <w:p>
+      <w:pPr>
+        <w:spacing w:after="200"/>
+        <w:jc w:val="center"/>
+      </w:pPr>
+      <w:r>
+        <w:rPr>
+          <w:i/>
+          <w:iCs/>
+          <w:color w:val="666666"/>
+          <w:sz w:val="18"/>
+          <w:szCs w:val="18"/>
+        </w:rPr>
+        <w:t xml:space="preserve">FIM Inventory after restoration: SHA-256 correctly matches the original, with no alert generated for the change</w:t>
+      </w:r>
+    </w:p>
     <w:p>
       <w:pPr>
         <w:spacing w:after="280"/>

</xml_diff>

<commit_message>
Add Scenario 4 screenshots; correct scenario numbering
</commit_message>
<xml_diff>
--- a/docs/Enterprise_Wazuh_SOC_Deployment_Complete_Documentation.docx
+++ b/docs/Enterprise_Wazuh_SOC_Deployment_Complete_Documentation.docx
@@ -4634,54 +4634,142 @@
         <w:spacing w:after="140"/>
       </w:pPr>
       <w:r>
-        <w:t xml:space="preserve">Four confirmed CVSS 10.0 (Critical) CVEs were isolated for the report, all published in mid-August 2026 and detected roughly three weeks later, reflecting a real-world patch lag: CVE-2026-74475, CVE-2026-72421, CVE-2026-74279, and CVE-2026-72408, each verified independently against the Canonical Security Tracker.</w:t>
-      </w:r>
-    </w:p>
-    <w:tbl>
-      <w:tblPr>
-        <w:tblW w:type="dxa" w:w="9640"/>
-        <w:tblBorders>
-          <w:top w:val="single" w:color="auto" w:sz="4"/>
-          <w:left w:val="single" w:color="auto" w:sz="4"/>
-          <w:bottom w:val="single" w:color="auto" w:sz="4"/>
-          <w:right w:val="single" w:color="auto" w:sz="4"/>
-          <w:insideH w:val="single" w:color="auto" w:sz="4"/>
-          <w:insideV w:val="single" w:color="auto" w:sz="4"/>
-        </w:tblBorders>
-      </w:tblPr>
-      <w:tblGrid>
-        <w:gridCol w:w="9640"/>
-      </w:tblGrid>
-      <w:tr>
-        <w:tc>
-          <w:tcPr>
-            <w:tcW w:type="dxa" w:w="9640"/>
-            <w:shd w:fill="F2F2F2" w:val="clear"/>
-            <w:tcMar>
-              <w:top w:type="dxa" w:w="200"/>
-              <w:left w:type="dxa" w:w="200"/>
-              <w:bottom w:type="dxa" w:w="200"/>
-              <w:right w:type="dxa" w:w="200"/>
-            </w:tcMar>
-          </w:tcPr>
-          <w:p>
-            <w:pPr>
-              <w:jc w:val="center"/>
-            </w:pPr>
-            <w:r>
-              <w:rPr>
-                <w:i/>
-                <w:iCs/>
-                <w:color w:val="666666"/>
-                <w:sz w:val="20"/>
-                <w:szCs w:val="20"/>
-              </w:rPr>
-              <w:t xml:space="preserve">[ SCREENSHOT PLACEHOLDER — Scenario 4 — supporting evidence ]</w:t>
-            </w:r>
-          </w:p>
-        </w:tc>
-      </w:tr>
-    </w:tbl>
+        <w:t xml:space="preserve">Four confirmed CVSS v3.1, base score 10.0 (Critical) CVEs were isolated for the report, all published in mid-August 2026 and detected roughly three weeks later, reflecting a real-world patch lag: CVE-2026-74475, CVE-2026-72421, CVE-2026-74279, and CVE-2026-72408, each verified independently against the Canonical Security Tracker.</w:t>
+      </w:r>
+    </w:p>
+    <w:p>
+      <w:pPr>
+        <w:pStyle w:val="Heading3"/>
+        <w:spacing w:after="100" w:before="200"/>
+      </w:pPr>
+      <w:r>
+        <w:t xml:space="preserve">Supporting Evidence</w:t>
+      </w:r>
+    </w:p>
+    <w:p>
+      <w:pPr>
+        <w:spacing w:after="60" w:before="160"/>
+        <w:jc w:val="center"/>
+      </w:pPr>
+      <w:r>
+        <w:drawing>
+          <wp:inline distT="0" distB="0" distL="0" distR="0">
+            <wp:extent cx="4953000" cy="2600325"/>
+            <wp:effectExtent t="0" r="0" b="0" l="0"/>
+            <wp:docPr id="1" name="" descr="" title=""/>
+            <wp:cNvGraphicFramePr>
+              <a:graphicFrameLocks xmlns:a="http://schemas.openxmlformats.org/drawingml/2006/main" noChangeAspect="1"/>
+            </wp:cNvGraphicFramePr>
+            <a:graphic xmlns:a="http://schemas.openxmlformats.org/drawingml/2006/main">
+              <a:graphicData uri="http://schemas.openxmlformats.org/drawingml/2006/picture">
+                <pic:pic xmlns:pic="http://schemas.openxmlformats.org/drawingml/2006/picture">
+                  <pic:nvPicPr>
+                    <pic:cNvPr id="0" name="" descr=""/>
+                    <pic:cNvPicPr>
+                      <a:picLocks noChangeAspect="1" noChangeArrowheads="1"/>
+                    </pic:cNvPicPr>
+                  </pic:nvPicPr>
+                  <pic:blipFill>
+                    <a:blip r:embed="rId15" cstate="none"/>
+                    <a:srcRect/>
+                    <a:stretch>
+                      <a:fillRect/>
+                    </a:stretch>
+                  </pic:blipFill>
+                  <pic:spPr bwMode="auto">
+                    <a:xfrm>
+                      <a:off x="0" y="0"/>
+                      <a:ext cx="4953000" cy="2600325"/>
+                    </a:xfrm>
+                    <a:prstGeom prst="rect">
+                      <a:avLst/>
+                    </a:prstGeom>
+                  </pic:spPr>
+                </pic:pic>
+              </a:graphicData>
+            </a:graphic>
+          </wp:inline>
+        </w:drawing>
+      </w:r>
+    </w:p>
+    <w:p>
+      <w:pPr>
+        <w:spacing w:after="200"/>
+        <w:jc w:val="center"/>
+      </w:pPr>
+      <w:r>
+        <w:rPr>
+          <w:i/>
+          <w:iCs/>
+          <w:color w:val="666666"/>
+          <w:sz w:val="18"/>
+          <w:szCs w:val="18"/>
+        </w:rPr>
+        <w:t xml:space="preserve">Vulnerability Detection dashboard: severity breakdown (352/1,666/328/6/1,328) and top-5 packages confirming the 1,840/1,840 doubled-kernel finding</w:t>
+      </w:r>
+    </w:p>
+    <w:p>
+      <w:pPr>
+        <w:spacing w:after="60" w:before="160"/>
+        <w:jc w:val="center"/>
+      </w:pPr>
+      <w:r>
+        <w:drawing>
+          <wp:inline distT="0" distB="0" distL="0" distR="0">
+            <wp:extent cx="4953000" cy="2600325"/>
+            <wp:effectExtent t="0" r="0" b="0" l="0"/>
+            <wp:docPr id="1" name="" descr="" title=""/>
+            <wp:cNvGraphicFramePr>
+              <a:graphicFrameLocks xmlns:a="http://schemas.openxmlformats.org/drawingml/2006/main" noChangeAspect="1"/>
+            </wp:cNvGraphicFramePr>
+            <a:graphic xmlns:a="http://schemas.openxmlformats.org/drawingml/2006/main">
+              <a:graphicData uri="http://schemas.openxmlformats.org/drawingml/2006/picture">
+                <pic:pic xmlns:pic="http://schemas.openxmlformats.org/drawingml/2006/picture">
+                  <pic:nvPicPr>
+                    <pic:cNvPr id="0" name="" descr=""/>
+                    <pic:cNvPicPr>
+                      <a:picLocks noChangeAspect="1" noChangeArrowheads="1"/>
+                    </pic:cNvPicPr>
+                  </pic:nvPicPr>
+                  <pic:blipFill>
+                    <a:blip r:embed="rId16" cstate="none"/>
+                    <a:srcRect/>
+                    <a:stretch>
+                      <a:fillRect/>
+                    </a:stretch>
+                  </pic:blipFill>
+                  <pic:spPr bwMode="auto">
+                    <a:xfrm>
+                      <a:off x="0" y="0"/>
+                      <a:ext cx="4953000" cy="2600325"/>
+                    </a:xfrm>
+                    <a:prstGeom prst="rect">
+                      <a:avLst/>
+                    </a:prstGeom>
+                  </pic:spPr>
+                </pic:pic>
+              </a:graphicData>
+            </a:graphic>
+          </wp:inline>
+        </w:drawing>
+      </w:r>
+    </w:p>
+    <w:p>
+      <w:pPr>
+        <w:spacing w:after="200"/>
+        <w:jc w:val="center"/>
+      </w:pPr>
+      <w:r>
+        <w:rPr>
+          <w:i/>
+          <w:iCs/>
+          <w:color w:val="666666"/>
+          <w:sz w:val="18"/>
+          <w:szCs w:val="18"/>
+        </w:rPr>
+        <w:t xml:space="preserve">CVE-2026-74475: published Aug 15, 2026, with Ubuntu security and CVE.org references</w:t>
+      </w:r>
+    </w:p>
     <w:p>
       <w:pPr>
         <w:spacing w:after="280"/>

</xml_diff>